<commit_message>
GitHub Sprint: explicit fork + dot-key web-editor workflow; landing page prerequisites
Slide 50 (Sprint Mechanics) now lists seven concrete steps with the dot-key
trick highlighted: students press '.' on their keyboard inside their fork to
launch the full GitHub web editor, no local git required. Same change is
mirrored in the PowerPoint deck, speaker notes inside the pptx, and the
Word-formatted spoken script.

The landing page (landing/index.html) gains a Before-you-arrive section
listing the two prerequisites: a Google account for Colab, and a GitHub
account for the contribution sprint. Linked to github.com/signup so anyone
without an account can create one before May 15.
</commit_message>
<xml_diff>
--- a/WSU-Workshop-Speech.docx
+++ b/WSU-Workshop-Speech.docx
@@ -3300,7 +3300,7 @@
         <w:rPr>
           <w:sz w:val="26"/>
         </w:rPr>
-        <w:t>Here's how it works.</w:t>
+        <w:t>Here's how it works. Seven steps.</w:t>
       </w:r>
     </w:p>
     <w:p>
@@ -3311,7 +3311,7 @@
         <w:rPr>
           <w:sz w:val="26"/>
         </w:rPr>
-        <w:t>Open github-dot-com slash cgrtml slash neural-trees. Go to the Issues tab.</w:t>
+        <w:t>One. Open github-dot-com slash cgrtml slash neural-trees. Go to the Issues tab.</w:t>
       </w:r>
     </w:p>
     <w:p>
@@ -3322,7 +3322,7 @@
         <w:rPr>
           <w:sz w:val="26"/>
         </w:rPr>
-        <w:t>Filter by 'good first issue.' Pick one — they're all ten to twenty minute scope.</w:t>
+        <w:t>Two. Filter by 'good first issue.' Pick one — they're all ten to twenty minute scope.</w:t>
       </w:r>
     </w:p>
     <w:p>
@@ -3333,7 +3333,7 @@
         <w:rPr>
           <w:sz w:val="26"/>
         </w:rPr>
-        <w:t>Comment 'I'm taking this' so two people don't pick the same one.</w:t>
+        <w:t>Three. Comment 'I'm taking this' so two people don't pick the same one.</w:t>
       </w:r>
     </w:p>
     <w:p>
@@ -3344,7 +3344,18 @@
         <w:rPr>
           <w:sz w:val="26"/>
         </w:rPr>
-        <w:t>Fork the repo, make the change in your fork, and open a pull request.</w:t>
+        <w:t>Four. Click the Fork button — top right of the page. That gives you your own copy of the repo.</w:t>
+      </w:r>
+    </w:p>
+    <w:p>
+      <w:pPr>
+        <w:spacing w:line="348" w:lineRule="auto" w:after="160"/>
+      </w:pPr>
+      <w:r>
+        <w:rPr>
+          <w:sz w:val="26"/>
+        </w:rPr>
+        <w:t>Five. Open the file you want to edit — in YOUR fork, not in mine.</w:t>
       </w:r>
     </w:p>
     <w:p>
@@ -3358,7 +3369,43 @@
           <w:color w:val="141414"/>
           <w:sz w:val="26"/>
         </w:rPr>
-        <w:t>I'll review it from my laptop right here on stage. If it's correct, I merge it on the spot. There are about twenty issues waiting. Pick what fits your level.</w:t>
+        <w:t>And here's the trick that saves you ten minutes: press the dot key on your keyboard. GitHub's full web editor opens, right there in the browser. You can edit like you're in VS Code.</w:t>
+      </w:r>
+    </w:p>
+    <w:p>
+      <w:pPr>
+        <w:spacing w:line="348" w:lineRule="auto" w:after="160"/>
+      </w:pPr>
+      <w:r>
+        <w:rPr>
+          <w:sz w:val="26"/>
+        </w:rPr>
+        <w:t>Six. Commit your change on a new branch. Then click 'Compare and pull request,' add a short description, and submit.</w:t>
+      </w:r>
+    </w:p>
+    <w:p>
+      <w:pPr>
+        <w:spacing w:line="348" w:lineRule="auto" w:after="160"/>
+      </w:pPr>
+      <w:r>
+        <w:rPr>
+          <w:sz w:val="26"/>
+        </w:rPr>
+        <w:t>Seven. I'll review it from my laptop right here on stage. If it's correct, I merge it on the spot.</w:t>
+      </w:r>
+    </w:p>
+    <w:p>
+      <w:pPr>
+        <w:spacing w:before="80" w:after="80"/>
+        <w:ind w:left="432"/>
+      </w:pPr>
+      <w:r>
+        <w:rPr>
+          <w:b/>
+          <w:color w:val="141414"/>
+          <w:sz w:val="26"/>
+        </w:rPr>
+        <w:t>No local git. No clone. No tokens. Everything in the browser. About twenty issues are waiting. Pick what fits your level.</w:t>
       </w:r>
     </w:p>
     <w:p>

</xml_diff>

<commit_message>
Add 'How a Colab Notebook Works' beginner slide; strip all PowerPoint notes
New slide 22 (right after the QR code) walks first-time notebook users through
the absolute basics: each gray box is a cell, click + Shift+Enter to run,
[*] means running and [1] means done, red box = error read the last red line,
run cells top-to-bottom. This is the slide that prevents 11 questions later.

All speaker notes have been removed from the PowerPoint file. The presenter
has their own separate notes in WSU-Workshop-Speech.docx and does not want
the per-slide notes panel populated. scripts/strip_notes.py clears every
slide's notes_text_frame in one pass.

The speech doc keeps its full first-person script and adds a section for
slide 22, then renumbers all subsequent slides by +1 so deck and script
match. Final count: 57 slides total in both files.
</commit_message>
<xml_diff>
--- a/WSU-Workshop-Speech.docx
+++ b/WSU-Workshop-Speech.docx
@@ -1353,7 +1353,7 @@
           <w:color w:val="1F4E79"/>
           <w:sz w:val="30"/>
         </w:rPr>
-        <w:t>Slide 22  ·  Activity 1 Overview</w:t>
+        <w:t>Slide 22  ·  How a Colab Notebook Works</w:t>
       </w:r>
       <w:r>
         <w:rPr>
@@ -1372,7 +1372,7 @@
         <w:rPr>
           <w:sz w:val="26"/>
         </w:rPr>
-        <w:t>Quick overview of the next fifty-five minutes. Six main stages.</w:t>
+        <w:t>Before we start the steps, thirty seconds on how Colab actually works. If you've never used a notebook before, this is the only thing you need to know.</w:t>
       </w:r>
     </w:p>
     <w:p>
@@ -1383,7 +1383,18 @@
         <w:rPr>
           <w:sz w:val="26"/>
         </w:rPr>
-        <w:t>We load CMAPSS and look at it. Bin the labels into three classes. Train the Soft Decision Tree — that takes about a minute. Evaluate it with a confusion matrix.</w:t>
+        <w:t>Your notebook is a list of cells. Each gray box you see is one cell. To run a cell, click into it, then press Shift+Enter. You can also click the play button on the left of the cell.</w:t>
+      </w:r>
+    </w:p>
+    <w:p>
+      <w:pPr>
+        <w:spacing w:line="348" w:lineRule="auto" w:after="160"/>
+      </w:pPr>
+      <w:r>
+        <w:rPr>
+          <w:sz w:val="26"/>
+        </w:rPr>
+        <w:t>While a cell is running, you'll see a star in brackets next to it. When it finishes, the star turns into a number — that's the order it ran in. If you see a red box, that's an error. Always read the LAST line of red text; that's the actual error message.</w:t>
       </w:r>
     </w:p>
     <w:p>
@@ -1397,7 +1408,18 @@
           <w:color w:val="141414"/>
           <w:sz w:val="26"/>
         </w:rPr>
-        <w:t>And then — this is the step that matters most — we traverse one prediction. We literally read out the rule the model used. If you remember one thing from this entire workshop, it should be that step. Let's start.</w:t>
+        <w:t>Most important rule: run cells in order, top to bottom. Don't skip cells. If you do, you'll get 'name is not defined' errors because the variable wasn't created yet.</w:t>
+      </w:r>
+    </w:p>
+    <w:p>
+      <w:pPr>
+        <w:spacing w:line="348" w:lineRule="auto" w:after="160"/>
+      </w:pPr>
+      <w:r>
+        <w:rPr>
+          <w:sz w:val="26"/>
+        </w:rPr>
+        <w:t>Okay. With that out of the way, let's look at what the next fifty-five minutes look like.</w:t>
       </w:r>
     </w:p>
     <w:p>
@@ -1410,7 +1432,7 @@
           <w:color w:val="1F4E79"/>
           <w:sz w:val="30"/>
         </w:rPr>
-        <w:t>Slide 23  ·  Step 1 — Imports</w:t>
+        <w:t>Slide 23  ·  Activity 1 Overview</w:t>
       </w:r>
       <w:r>
         <w:rPr>
@@ -1429,7 +1451,7 @@
         <w:rPr>
           <w:sz w:val="26"/>
         </w:rPr>
-        <w:t>First step: imports. Paste this code into a fresh cell. Hit Shift+Enter. You should see 'All set.'</w:t>
+        <w:t>Quick overview of the next fifty-five minutes. Six main stages.</w:t>
       </w:r>
     </w:p>
     <w:p>
@@ -1440,7 +1462,21 @@
         <w:rPr>
           <w:sz w:val="26"/>
         </w:rPr>
-        <w:t>If you get an IndentationError, that means one of your lines has a stray space at the beginning. Copy-paste does that sometimes. Click into the cell, hit Command-A to select everything, then Shift+Tab to clear indentation, and run again.</w:t>
+        <w:t>We load CMAPSS and look at it. Bin the labels into three classes. Train the Soft Decision Tree — that takes about a minute. Evaluate it with a confusion matrix.</w:t>
+      </w:r>
+    </w:p>
+    <w:p>
+      <w:pPr>
+        <w:spacing w:before="80" w:after="80"/>
+        <w:ind w:left="432"/>
+      </w:pPr>
+      <w:r>
+        <w:rPr>
+          <w:b/>
+          <w:color w:val="141414"/>
+          <w:sz w:val="26"/>
+        </w:rPr>
+        <w:t>And then — this is the step that matters most — we traverse one prediction. We literally read out the rule the model used. If you remember one thing from this entire workshop, it should be that step. Let's start.</w:t>
       </w:r>
     </w:p>
     <w:p>
@@ -1453,7 +1489,7 @@
           <w:color w:val="1F4E79"/>
           <w:sz w:val="30"/>
         </w:rPr>
-        <w:t>Slide 24  ·  Step 2 — Load Data</w:t>
+        <w:t>Slide 24  ·  Step 1 — Imports</w:t>
       </w:r>
       <w:r>
         <w:rPr>
@@ -1461,6 +1497,49 @@
           <w:color w:val="888888"/>
           <w:sz w:val="22"/>
         </w:rPr>
+        <w:t xml:space="preserve">        09:34</w:t>
+      </w:r>
+    </w:p>
+    <w:p>
+      <w:pPr>
+        <w:spacing w:line="348" w:lineRule="auto" w:after="160"/>
+      </w:pPr>
+      <w:r>
+        <w:rPr>
+          <w:sz w:val="26"/>
+        </w:rPr>
+        <w:t>First step: imports. Paste this code into a fresh cell. Hit Shift+Enter. You should see 'All set.'</w:t>
+      </w:r>
+    </w:p>
+    <w:p>
+      <w:pPr>
+        <w:spacing w:line="348" w:lineRule="auto" w:after="160"/>
+      </w:pPr>
+      <w:r>
+        <w:rPr>
+          <w:sz w:val="26"/>
+        </w:rPr>
+        <w:t>If you get an IndentationError, that means one of your lines has a stray space at the beginning. Copy-paste does that sometimes. Click into the cell, hit Command-A to select everything, then Shift+Tab to clear indentation, and run again.</w:t>
+      </w:r>
+    </w:p>
+    <w:p>
+      <w:pPr>
+        <w:spacing w:before="360" w:after="40"/>
+      </w:pPr>
+      <w:r>
+        <w:rPr>
+          <w:b/>
+          <w:color w:val="1F4E79"/>
+          <w:sz w:val="30"/>
+        </w:rPr>
+        <w:t>Slide 25  ·  Step 2 — Load Data</w:t>
+      </w:r>
+      <w:r>
+        <w:rPr>
+          <w:i/>
+          <w:color w:val="888888"/>
+          <w:sz w:val="22"/>
+        </w:rPr>
         <w:t xml:space="preserve">        09:37</w:t>
       </w:r>
     </w:p>
@@ -1510,7 +1589,7 @@
           <w:color w:val="1F4E79"/>
           <w:sz w:val="30"/>
         </w:rPr>
-        <w:t>Slide 25  ·  Step 3 — Compute RUL</w:t>
+        <w:t>Slide 26  ·  Step 3 — Compute RUL</w:t>
       </w:r>
       <w:r>
         <w:rPr>
@@ -1553,7 +1632,7 @@
           <w:color w:val="1F4E79"/>
           <w:sz w:val="30"/>
         </w:rPr>
-        <w:t>Slide 26  ·  Step 4 — Plot Engine 1</w:t>
+        <w:t>Slide 27  ·  Step 4 — Plot Engine 1</w:t>
       </w:r>
       <w:r>
         <w:rPr>
@@ -1610,7 +1689,7 @@
           <w:color w:val="1F4E79"/>
           <w:sz w:val="30"/>
         </w:rPr>
-        <w:t>Slide 27  ·  Step 5 — Bin RUL</w:t>
+        <w:t>Slide 28  ·  Step 5 — Bin RUL</w:t>
       </w:r>
       <w:r>
         <w:rPr>
@@ -1653,7 +1732,7 @@
           <w:color w:val="1F4E79"/>
           <w:sz w:val="30"/>
         </w:rPr>
-        <w:t>Slide 28  ·  Step 6 — Feature Matrix</w:t>
+        <w:t>Slide 29  ·  Step 6 — Feature Matrix</w:t>
       </w:r>
       <w:r>
         <w:rPr>
@@ -1696,7 +1775,7 @@
           <w:color w:val="1F4E79"/>
           <w:sz w:val="30"/>
         </w:rPr>
-        <w:t>Slide 29  ·  Step 7 — Train/Test Split</w:t>
+        <w:t>Slide 30  ·  Step 7 — Train/Test Split</w:t>
       </w:r>
       <w:r>
         <w:rPr>
@@ -1750,7 +1829,7 @@
           <w:color w:val="1F4E79"/>
           <w:sz w:val="30"/>
         </w:rPr>
-        <w:t>Slide 30  ·  Step 8 — Train SDT</w:t>
+        <w:t>Slide 31  ·  Step 8 — Train SDT</w:t>
       </w:r>
       <w:r>
         <w:rPr>
@@ -1842,7 +1921,7 @@
           <w:color w:val="1F4E79"/>
           <w:sz w:val="30"/>
         </w:rPr>
-        <w:t>Slide 31  ·  Step 9 — Confusion Matrix</w:t>
+        <w:t>Slide 32  ·  Step 9 — Confusion Matrix</w:t>
       </w:r>
       <w:r>
         <w:rPr>
@@ -1924,7 +2003,7 @@
           <w:color w:val="1F4E79"/>
           <w:sz w:val="30"/>
         </w:rPr>
-        <w:t>Slide 32  ·  Step 10 — Split Weights</w:t>
+        <w:t>Slide 33  ·  Step 10 — Split Weights</w:t>
       </w:r>
       <w:r>
         <w:rPr>
@@ -1981,7 +2060,7 @@
           <w:color w:val="1F4E79"/>
           <w:sz w:val="30"/>
         </w:rPr>
-        <w:t>Slide 33  ·  Step 11 — Traverse Prediction</w:t>
+        <w:t>Slide 34  ·  Step 11 — Traverse Prediction</w:t>
       </w:r>
       <w:r>
         <w:rPr>
@@ -2052,7 +2131,7 @@
           <w:color w:val="1F4E79"/>
           <w:sz w:val="30"/>
         </w:rPr>
-        <w:t>Slide 34  ·  Checkpoint</w:t>
+        <w:t>Slide 35  ·  Checkpoint</w:t>
       </w:r>
       <w:r>
         <w:rPr>
@@ -2144,7 +2223,7 @@
           <w:color w:val="1F4E79"/>
           <w:sz w:val="30"/>
         </w:rPr>
-        <w:t>Slide 35  ·  Activity 2 Intro</w:t>
+        <w:t>Slide 36  ·  Activity 2 Intro</w:t>
       </w:r>
       <w:r>
         <w:rPr>
@@ -2201,7 +2280,7 @@
           <w:color w:val="1F4E79"/>
           <w:sz w:val="30"/>
         </w:rPr>
-        <w:t>Slide 36  ·  Scenario</w:t>
+        <w:t>Slide 37  ·  Scenario</w:t>
       </w:r>
       <w:r>
         <w:rPr>
@@ -2258,7 +2337,7 @@
           <w:color w:val="1F4E79"/>
           <w:sz w:val="30"/>
         </w:rPr>
-        <w:t>Slide 37  ·  Teams</w:t>
+        <w:t>Slide 38  ·  Teams</w:t>
       </w:r>
       <w:r>
         <w:rPr>
@@ -2314,7 +2393,7 @@
           <w:color w:val="1F4E79"/>
           <w:sz w:val="30"/>
         </w:rPr>
-        <w:t>Slide 38  ·  Three Attack Files</w:t>
+        <w:t>Slide 39  ·  Three Attack Files</w:t>
       </w:r>
       <w:r>
         <w:rPr>
@@ -2393,7 +2472,7 @@
           <w:color w:val="1F4E79"/>
           <w:sz w:val="30"/>
         </w:rPr>
-        <w:t>Slide 39  ·  A2 Step 1 — RF Baseline</w:t>
+        <w:t>Slide 40  ·  A2 Step 1 — RF Baseline</w:t>
       </w:r>
       <w:r>
         <w:rPr>
@@ -2450,7 +2529,7 @@
           <w:color w:val="1F4E79"/>
           <w:sz w:val="30"/>
         </w:rPr>
-        <w:t>Slide 40  ·  A2 Step 2 — Clean Baseline</w:t>
+        <w:t>Slide 41  ·  A2 Step 2 — Clean Baseline</w:t>
       </w:r>
       <w:r>
         <w:rPr>
@@ -2493,7 +2572,7 @@
           <w:color w:val="1F4E79"/>
           <w:sz w:val="30"/>
         </w:rPr>
-        <w:t>Slide 41  ·  A2 Step 3 — Score Attacks</w:t>
+        <w:t>Slide 42  ·  A2 Step 3 — Score Attacks</w:t>
       </w:r>
       <w:r>
         <w:rPr>
@@ -2597,7 +2676,7 @@
           <w:color w:val="1F4E79"/>
           <w:sz w:val="30"/>
         </w:rPr>
-        <w:t>Slide 42  ·  A2 Step 4 — Attack A</w:t>
+        <w:t>Slide 43  ·  A2 Step 4 — Attack A</w:t>
       </w:r>
       <w:r>
         <w:rPr>
@@ -2678,7 +2757,7 @@
           <w:color w:val="1F4E79"/>
           <w:sz w:val="30"/>
         </w:rPr>
-        <w:t>Slide 43  ·  A2 Step 5 — Attack B</w:t>
+        <w:t>Slide 44  ·  A2 Step 5 — Attack B</w:t>
       </w:r>
       <w:r>
         <w:rPr>
@@ -2771,7 +2850,7 @@
           <w:color w:val="1F4E79"/>
           <w:sz w:val="30"/>
         </w:rPr>
-        <w:t>Slide 44  ·  A2 Step 6 — Attack C</w:t>
+        <w:t>Slide 45  ·  A2 Step 6 — Attack C</w:t>
       </w:r>
       <w:r>
         <w:rPr>
@@ -2850,7 +2929,7 @@
           <w:color w:val="1F4E79"/>
           <w:sz w:val="30"/>
         </w:rPr>
-        <w:t>Slide 45  ·  A2 Step 7 — Quantify</w:t>
+        <w:t>Slide 46  ·  A2 Step 7 — Quantify</w:t>
       </w:r>
       <w:r>
         <w:rPr>
@@ -2989,7 +3068,7 @@
           <w:color w:val="1F4E79"/>
           <w:sz w:val="30"/>
         </w:rPr>
-        <w:t>Slide 46  ·  Time on Clock</w:t>
+        <w:t>Slide 47  ·  Time on Clock</w:t>
       </w:r>
       <w:r>
         <w:rPr>
@@ -3048,7 +3127,7 @@
           <w:color w:val="1F4E79"/>
           <w:sz w:val="30"/>
         </w:rPr>
-        <w:t>Slide 47  ·  Answers</w:t>
+        <w:t>Slide 48  ·  Answers</w:t>
       </w:r>
       <w:r>
         <w:rPr>
@@ -3140,7 +3219,7 @@
           <w:color w:val="1F4E79"/>
           <w:sz w:val="30"/>
         </w:rPr>
-        <w:t>Slide 48  ·  What Just Happened</w:t>
+        <w:t>Slide 49  ·  What Just Happened</w:t>
       </w:r>
       <w:r>
         <w:rPr>
@@ -3235,7 +3314,7 @@
           <w:color w:val="1F4E79"/>
           <w:sz w:val="30"/>
         </w:rPr>
-        <w:t>Slide 49  ·  Sprint Intro</w:t>
+        <w:t>Slide 50  ·  Sprint Intro</w:t>
       </w:r>
       <w:r>
         <w:rPr>
@@ -3281,7 +3360,7 @@
           <w:color w:val="1F4E79"/>
           <w:sz w:val="30"/>
         </w:rPr>
-        <w:t>Slide 50  ·  Sprint Mechanics</w:t>
+        <w:t>Slide 51  ·  Sprint Mechanics</w:t>
       </w:r>
       <w:r>
         <w:rPr>
@@ -3418,7 +3497,7 @@
           <w:color w:val="1F4E79"/>
           <w:sz w:val="30"/>
         </w:rPr>
-        <w:t>Slide 51  ·  Why Do It</w:t>
+        <w:t>Slide 52  ·  Why Do It</w:t>
       </w:r>
       <w:r>
         <w:rPr>
@@ -3548,7 +3627,7 @@
           <w:color w:val="1F4E79"/>
           <w:sz w:val="30"/>
         </w:rPr>
-        <w:t>Slide 52  ·  EU AI Act</w:t>
+        <w:t>Slide 53  ·  EU AI Act</w:t>
       </w:r>
       <w:r>
         <w:rPr>
@@ -3605,7 +3684,7 @@
           <w:color w:val="1F4E79"/>
           <w:sz w:val="30"/>
         </w:rPr>
-        <w:t>Slide 53  ·  Wrap-Up</w:t>
+        <w:t>Slide 54  ·  Wrap-Up</w:t>
       </w:r>
       <w:r>
         <w:rPr>
@@ -3673,7 +3752,7 @@
           <w:color w:val="1F4E79"/>
           <w:sz w:val="30"/>
         </w:rPr>
-        <w:t>Slide 54  ·  Career Bridge</w:t>
+        <w:t>Slide 55  ·  Career Bridge</w:t>
       </w:r>
       <w:r>
         <w:rPr>
@@ -3741,7 +3820,7 @@
           <w:color w:val="1F4E79"/>
           <w:sz w:val="30"/>
         </w:rPr>
-        <w:t>Slide 55  ·  Links</w:t>
+        <w:t>Slide 56  ·  Links</w:t>
       </w:r>
       <w:r>
         <w:rPr>
@@ -3806,7 +3885,7 @@
           <w:color w:val="1F4E79"/>
           <w:sz w:val="30"/>
         </w:rPr>
-        <w:t>Slide 56  ·  Thank You</w:t>
+        <w:t>Slide 57  ·  Thank You</w:t>
       </w:r>
       <w:r>
         <w:rPr>

</xml_diff>

<commit_message>
Fix speech doc: add Setup-cell reminder to Step 1; clean up Time-on-Clock framing
Slide 24 (Step 1 Imports) now opens with an emphasis line reminding the
presenter to point students at the Setup cell first. Without that, students
who paste Step 1 into a fresh Colab kernel hit ModuleNotFoundError on the
'from neural_trees import SoftDecisionTree' line.

Slide 47 (Time on Clock) drops the confusing '10:42 — actually start'
timestamp. The new framing is explicit: the seven step slides that come
before this one are reference material students follow in their notebooks
during the 17-minute team work window; the clock slide is what stays up on
the projector while you walk around.
</commit_message>
<xml_diff>
--- a/WSU-Workshop-Speech.docx
+++ b/WSU-Workshop-Speech.docx
@@ -1502,13 +1502,27 @@
     </w:p>
     <w:p>
       <w:pPr>
+        <w:spacing w:before="80" w:after="80"/>
+        <w:ind w:left="432"/>
+      </w:pPr>
+      <w:r>
+        <w:rPr>
+          <w:b/>
+          <w:color w:val="141414"/>
+          <w:sz w:val="26"/>
+        </w:rPr>
+        <w:t>Quick note before Step 1: at the very top of your notebook there is a Setup cell. Run that one FIRST. It installs the neural-trees package and downloads the data files. Takes about twenty seconds. You should see 'Setup done.' before you do anything else.</w:t>
+      </w:r>
+    </w:p>
+    <w:p>
+      <w:pPr>
         <w:spacing w:line="348" w:lineRule="auto" w:after="160"/>
       </w:pPr>
       <w:r>
         <w:rPr>
           <w:sz w:val="26"/>
         </w:rPr>
-        <w:t>First step: imports. Paste this code into a fresh cell. Hit Shift+Enter. You should see 'All set.'</w:t>
+        <w:t>Okay, now Step 1: imports. Paste this code into the empty cell under the Step 1 heading. Hit Shift+Enter. You should see 'All set.'</w:t>
       </w:r>
     </w:p>
     <w:p>
@@ -3068,7 +3082,7 @@
           <w:color w:val="1F4E79"/>
           <w:sz w:val="30"/>
         </w:rPr>
-        <w:t>Slide 47  ·  Time on Clock</w:t>
+        <w:t>Slide 47  ·  Time on Clock — Teams Working</w:t>
       </w:r>
       <w:r>
         <w:rPr>
@@ -3076,7 +3090,7 @@
           <w:color w:val="888888"/>
           <w:sz w:val="22"/>
         </w:rPr>
-        <w:t xml:space="preserve">        10:42 — actually start</w:t>
+        <w:t xml:space="preserve">        10:40</w:t>
       </w:r>
     </w:p>
     <w:p>
@@ -3089,7 +3103,7 @@
           <w:color w:val="996600"/>
           <w:sz w:val="22"/>
         </w:rPr>
-        <w:t>[This is the SLIDE that's up while teams work for 17 minutes. Start the timer here, do not skip.]</w:t>
+        <w:t>[This slide stays UP for the full 17-minute team work window. The seven step slides (Steps 40 to 46) are reference material the students follow in their notebooks; you do not need to walk through each one on stage. Start the timer here.]</w:t>
       </w:r>
     </w:p>
     <w:p>
@@ -3100,7 +3114,7 @@
         <w:rPr>
           <w:sz w:val="26"/>
         </w:rPr>
-        <w:t>Okay, seventeen minutes on the clock starting now. Open activity-two-student-dot-ipynb on your laptop. Discuss with your team. I'm walking around. If you have questions, raise a hand.</w:t>
+        <w:t>Okay, seventeen minutes on the clock starting now. The seven steps are in your notebook — follow them top to bottom. Discuss with your team. I'm walking around. If you have questions, raise a hand.</w:t>
       </w:r>
     </w:p>
     <w:p>
@@ -3114,7 +3128,7 @@
           <w:color w:val="141414"/>
           <w:sz w:val="26"/>
         </w:rPr>
-        <w:t>I'll give hints, but I won't give you the answer. Go.</w:t>
+        <w:t>I'll give hints, but I will not give you the answer. Go.</w:t>
       </w:r>
     </w:p>
     <w:p>

</xml_diff>